<commit_message>
Resume: Global Trading Regulatory & Compliance Analyst @ ExxonMobil India Careers (MNC)
</commit_message>
<xml_diff>
--- a/resumes/Resume_Global_Trading_Regulatory___Complia_ExxonMobil_India_Careers__MNC_.docx
+++ b/resumes/Resume_Global_Trading_Regulatory___Complia_ExxonMobil_India_Careers__MNC_.docx
@@ -117,7 +117,7 @@
         <w:pBdr>
           <w:bottom w:val="single" w:sz="6" w:space="1" w:color="000000"/>
         </w:pBdr>
-        <w:spacing w:before="89" w:after="0"/>
+        <w:spacing w:before="172" w:after="0"/>
       </w:pPr>
       <w:r>
         <w:rPr>
@@ -289,7 +289,7 @@
     </w:p>
     <w:p>
       <w:pPr>
-        <w:spacing w:before="14" w:after="14"/>
+        <w:spacing w:before="32" w:after="32"/>
       </w:pPr>
     </w:p>
     <w:p>
@@ -297,7 +297,7 @@
         <w:pBdr>
           <w:bottom w:val="single" w:sz="6" w:space="1" w:color="000000"/>
         </w:pBdr>
-        <w:spacing w:before="89" w:after="0"/>
+        <w:spacing w:before="172" w:after="0"/>
       </w:pPr>
       <w:r>
         <w:rPr>
@@ -404,16 +404,16 @@
           <w:ilvl w:val="0"/>
           <w:numId w:val="2"/>
         </w:numPr>
-        <w:spacing w:before="13" w:after="27"/>
-      </w:pPr>
-      <w:r>
-        <w:rPr>
-          <w:rFonts w:ascii="Source Sans Pro" w:eastAsia="Source Sans Pro" w:hAnsi="Source Sans Pro" w:cs="Source Sans Pro"/>
-          <w:color w:val="000000"/>
-          <w:sz w:val="19"/>
-          <w:szCs w:val="19"/>
-        </w:rPr>
-        <w:t>Triaged 50+ weekly inventory reimbursement cases by severity and policy eligibility, adhering to regulatory guidelines and ensuring compliance with established procedures.</w:t>
+        <w:spacing w:before="13" w:after="45"/>
+      </w:pPr>
+      <w:r>
+        <w:rPr>
+          <w:rFonts w:ascii="Source Sans Pro" w:eastAsia="Source Sans Pro" w:hAnsi="Source Sans Pro" w:cs="Source Sans Pro"/>
+          <w:color w:val="000000"/>
+          <w:sz w:val="19"/>
+          <w:szCs w:val="19"/>
+        </w:rPr>
+        <w:t>Documented investigation findings and corrective actions in audit-ready case notes for compliance tracking.</w:t>
       </w:r>
     </w:p>
     <w:p>
@@ -423,16 +423,16 @@
           <w:ilvl w:val="0"/>
           <w:numId w:val="2"/>
         </w:numPr>
-        <w:spacing w:before="13" w:after="27"/>
-      </w:pPr>
-      <w:r>
-        <w:rPr>
-          <w:rFonts w:ascii="Source Sans Pro" w:eastAsia="Source Sans Pro" w:hAnsi="Source Sans Pro" w:cs="Source Sans Pro"/>
-          <w:color w:val="000000"/>
-          <w:sz w:val="19"/>
-          <w:szCs w:val="19"/>
-        </w:rPr>
-        <w:t>Conducted root cause analysis on seller claims to identify policy violations and anomalous patterns, demonstrating a strong understanding of regulatory requirements and compliance frameworks.</w:t>
+        <w:spacing w:before="13" w:after="45"/>
+      </w:pPr>
+      <w:r>
+        <w:rPr>
+          <w:rFonts w:ascii="Source Sans Pro" w:eastAsia="Source Sans Pro" w:hAnsi="Source Sans Pro" w:cs="Source Sans Pro"/>
+          <w:color w:val="000000"/>
+          <w:sz w:val="19"/>
+          <w:szCs w:val="19"/>
+        </w:rPr>
+        <w:t>Analyzed seller claims to identify policy risk and validate decisions against control criteria.</w:t>
       </w:r>
     </w:p>
     <w:p>
@@ -442,16 +442,16 @@
           <w:ilvl w:val="0"/>
           <w:numId w:val="2"/>
         </w:numPr>
-        <w:spacing w:before="13" w:after="27"/>
-      </w:pPr>
-      <w:r>
-        <w:rPr>
-          <w:rFonts w:ascii="Source Sans Pro" w:eastAsia="Source Sans Pro" w:hAnsi="Source Sans Pro" w:cs="Source Sans Pro"/>
-          <w:color w:val="000000"/>
-          <w:sz w:val="19"/>
-          <w:szCs w:val="19"/>
-        </w:rPr>
-        <w:t>Maintained accurate case documentation, recording investigation findings, decisions, and corrective actions for regulatory and compliance purposes.</w:t>
+        <w:spacing w:before="13" w:after="45"/>
+      </w:pPr>
+      <w:r>
+        <w:rPr>
+          <w:rFonts w:ascii="Source Sans Pro" w:eastAsia="Source Sans Pro" w:hAnsi="Source Sans Pro" w:cs="Source Sans Pro"/>
+          <w:color w:val="000000"/>
+          <w:sz w:val="19"/>
+          <w:szCs w:val="19"/>
+        </w:rPr>
+        <w:t>Investigated reimbursement cases for policy exceptions, flagging risk indicators and evidence gaps.</w:t>
       </w:r>
     </w:p>
     <w:p>
@@ -461,47 +461,47 @@
           <w:ilvl w:val="0"/>
           <w:numId w:val="2"/>
         </w:numPr>
-        <w:spacing w:before="13" w:after="27"/>
-      </w:pPr>
-      <w:r>
-        <w:rPr>
-          <w:rFonts w:ascii="Source Sans Pro" w:eastAsia="Source Sans Pro" w:hAnsi="Source Sans Pro" w:cs="Source Sans Pro"/>
-          <w:color w:val="000000"/>
-          <w:sz w:val="19"/>
-          <w:szCs w:val="19"/>
-        </w:rPr>
-        <w:t>[[AMZ_B</w:t>
-      </w:r>
-      <w:r>
-        <w:rPr>
-          <w:rFonts w:ascii="Source Sans Pro" w:eastAsia="Source Sans Pro" w:hAnsi="Source Sans Pro" w:cs="Source Sans Pro"/>
-          <w:color w:val="000000"/>
-          <w:sz w:val="19"/>
-          <w:szCs w:val="19"/>
-        </w:rPr>
-        <w:t>4</w:t>
-      </w:r>
-      <w:r>
-        <w:rPr>
-          <w:rFonts w:ascii="Source Sans Pro" w:eastAsia="Source Sans Pro" w:hAnsi="Source Sans Pro" w:cs="Source Sans Pro"/>
-          <w:color w:val="000000"/>
-          <w:sz w:val="19"/>
-          <w:szCs w:val="19"/>
-        </w:rPr>
-        <w:t>]]</w:t>
+        <w:spacing w:before="13" w:after="45"/>
+      </w:pPr>
+      <w:r>
+        <w:rPr>
+          <w:rFonts w:ascii="Source Sans Pro" w:eastAsia="Source Sans Pro" w:hAnsi="Source Sans Pro" w:cs="Source Sans Pro"/>
+          <w:color w:val="000000"/>
+          <w:sz w:val="19"/>
+          <w:szCs w:val="19"/>
+        </w:rPr>
+        <w:t>Triaged weekly cases by severity and eligibility, supporting audit documentation and control review.</w:t>
+      </w:r>
+      <w:r>
+        <w:rPr>
+          <w:rFonts w:ascii="Source Sans Pro" w:eastAsia="Source Sans Pro" w:hAnsi="Source Sans Pro" w:cs="Source Sans Pro"/>
+          <w:color w:val="000000"/>
+          <w:sz w:val="19"/>
+          <w:szCs w:val="19"/>
+        </w:rPr>
+        <w:t/>
+      </w:r>
+      <w:r>
+        <w:rPr>
+          <w:rFonts w:ascii="Source Sans Pro" w:eastAsia="Source Sans Pro" w:hAnsi="Source Sans Pro" w:cs="Source Sans Pro"/>
+          <w:color w:val="000000"/>
+          <w:sz w:val="19"/>
+          <w:szCs w:val="19"/>
+        </w:rPr>
+        <w:t/>
       </w:r>
     </w:p>
     <w:p>
       <w:pPr>
         <w:pStyle w:val="ListParagraph"/>
-        <w:spacing w:before="14" w:after="14"/>
+        <w:spacing w:before="32" w:after="32"/>
         <w:ind w:left="450"/>
       </w:pPr>
     </w:p>
     <w:p>
       <w:pPr>
         <w:pStyle w:val="ListParagraph"/>
-        <w:spacing w:before="14" w:after="14"/>
+        <w:spacing w:before="32" w:after="32"/>
         <w:ind w:left="450"/>
       </w:pPr>
     </w:p>
@@ -510,7 +510,7 @@
         <w:pBdr>
           <w:bottom w:val="single" w:sz="6" w:space="1" w:color="000000"/>
         </w:pBdr>
-        <w:spacing w:before="89" w:after="0"/>
+        <w:spacing w:before="172" w:after="0"/>
       </w:pPr>
       <w:r>
         <w:rPr>
@@ -577,16 +577,16 @@
           <w:ilvl w:val="0"/>
           <w:numId w:val="2"/>
         </w:numPr>
-        <w:spacing w:before="13" w:after="27"/>
-      </w:pPr>
-      <w:r>
-        <w:rPr>
-          <w:rFonts w:ascii="Source Sans Pro" w:eastAsia="Source Sans Pro" w:hAnsi="Source Sans Pro" w:cs="Source Sans Pro"/>
-          <w:color w:val="000000"/>
-          <w:sz w:val="19"/>
-          <w:szCs w:val="19"/>
-        </w:rPr>
-        <w:t>Developed multi-API threat intelligence pipeline: submits suspicious data to VirusTotal, AbuseIPDB, and URLScan.io; cross-references WHOIS, DNS, and SSL details for unified phishing probability score.</w:t>
+        <w:spacing w:before="13" w:after="45"/>
+      </w:pPr>
+      <w:r>
+        <w:rPr>
+          <w:rFonts w:ascii="Source Sans Pro" w:eastAsia="Source Sans Pro" w:hAnsi="Source Sans Pro" w:cs="Source Sans Pro"/>
+          <w:color w:val="000000"/>
+          <w:sz w:val="19"/>
+          <w:szCs w:val="19"/>
+        </w:rPr>
+        <w:t>Built multi-API threat intelligence pipeline: submits suspicious data to VirusTotal, AbuseIPDB, and URLScan.io; cross-references WHOIS, DNS, and SSL details for unified phishing probability score.</w:t>
       </w:r>
     </w:p>
     <w:p>
@@ -596,16 +596,16 @@
           <w:ilvl w:val="0"/>
           <w:numId w:val="2"/>
         </w:numPr>
-        <w:spacing w:before="13" w:after="27"/>
-      </w:pPr>
-      <w:r>
-        <w:rPr>
-          <w:rFonts w:ascii="Source Sans Pro" w:eastAsia="Source Sans Pro" w:hAnsi="Source Sans Pro" w:cs="Source Sans Pro"/>
-          <w:color w:val="000000"/>
-          <w:sz w:val="19"/>
-          <w:szCs w:val="19"/>
-        </w:rPr>
-        <w:t>Developed typosquatting detector generating domain variants and checking live DNS resolution to catch brand-impersonation attacks.</w:t>
+        <w:spacing w:before="13" w:after="45"/>
+      </w:pPr>
+      <w:r>
+        <w:rPr>
+          <w:rFonts w:ascii="Source Sans Pro" w:eastAsia="Source Sans Pro" w:hAnsi="Source Sans Pro" w:cs="Source Sans Pro"/>
+          <w:color w:val="000000"/>
+          <w:sz w:val="19"/>
+          <w:szCs w:val="19"/>
+        </w:rPr>
+        <w:t>Implemented typosquatting detector generating domain variants and checking live DNS resolution to catch brand-impersonation attacks.</w:t>
       </w:r>
     </w:p>
     <w:p>
@@ -615,21 +615,21 @@
           <w:ilvl w:val="0"/>
           <w:numId w:val="2"/>
         </w:numPr>
-        <w:spacing w:before="13" w:after="27"/>
-      </w:pPr>
-      <w:r>
-        <w:rPr>
-          <w:rFonts w:ascii="Source Sans Pro" w:eastAsia="Source Sans Pro" w:hAnsi="Source Sans Pro" w:cs="Source Sans Pro"/>
-          <w:color w:val="000000"/>
-          <w:sz w:val="19"/>
-          <w:szCs w:val="19"/>
-        </w:rPr>
-        <w:t>Developed Telegram bot interface for live IOC enrichment, supporting bulk CSV input/output and OSINT enrichment via theHarvester for domain profiling.</w:t>
-      </w:r>
-    </w:p>
-    <w:p>
-      <w:pPr>
-        <w:spacing w:before="14" w:after="14"/>
+        <w:spacing w:before="13" w:after="45"/>
+      </w:pPr>
+      <w:r>
+        <w:rPr>
+          <w:rFonts w:ascii="Source Sans Pro" w:eastAsia="Source Sans Pro" w:hAnsi="Source Sans Pro" w:cs="Source Sans Pro"/>
+          <w:color w:val="000000"/>
+          <w:sz w:val="19"/>
+          <w:szCs w:val="19"/>
+        </w:rPr>
+        <w:t>Deployed Telegram bot interface for live IOC enrichment, supporting bulk CSV input/output and OSINT enrichment via theHarvester for domain profiling.</w:t>
+      </w:r>
+    </w:p>
+    <w:p>
+      <w:pPr>
+        <w:spacing w:before="32" w:after="32"/>
       </w:pPr>
     </w:p>
     <w:p>
@@ -685,16 +685,16 @@
           <w:ilvl w:val="0"/>
           <w:numId w:val="2"/>
         </w:numPr>
-        <w:spacing w:before="13" w:after="27"/>
-      </w:pPr>
-      <w:r>
-        <w:rPr>
-          <w:rFonts w:ascii="Source Sans Pro" w:eastAsia="Source Sans Pro" w:hAnsi="Source Sans Pro" w:cs="Source Sans Pro"/>
-          <w:color w:val="000000"/>
-          <w:sz w:val="19"/>
-          <w:szCs w:val="19"/>
-        </w:rPr>
-        <w:t>Developed automated vulnerability assessment pipeline integrating Nessus and OpenVAS REST APIs in Python, generating CVE reports classified by CVSS severity and EPSS scoring from FIRST.org API.</w:t>
+        <w:spacing w:before="13" w:after="45"/>
+      </w:pPr>
+      <w:r>
+        <w:rPr>
+          <w:rFonts w:ascii="Source Sans Pro" w:eastAsia="Source Sans Pro" w:hAnsi="Source Sans Pro" w:cs="Source Sans Pro"/>
+          <w:color w:val="000000"/>
+          <w:sz w:val="19"/>
+          <w:szCs w:val="19"/>
+        </w:rPr>
+        <w:t>Developed automated vulnerability assessment pipeline in Python, integrating Nessus and OpenVAS APIs, with EPSS scoring from FIRST.org for prioritization.</w:t>
       </w:r>
     </w:p>
     <w:p>
@@ -704,7 +704,7 @@
           <w:ilvl w:val="0"/>
           <w:numId w:val="2"/>
         </w:numPr>
-        <w:spacing w:before="13" w:after="27"/>
+        <w:spacing w:before="13" w:after="45"/>
       </w:pPr>
       <w:r>
         <w:rPr>
@@ -723,22 +723,22 @@
           <w:ilvl w:val="0"/>
           <w:numId w:val="2"/>
         </w:numPr>
-        <w:spacing w:before="13" w:after="27"/>
-      </w:pPr>
-      <w:r>
-        <w:rPr>
-          <w:rFonts w:ascii="Source Sans Pro" w:eastAsia="Source Sans Pro" w:hAnsi="Source Sans Pro" w:cs="Source Sans Pro"/>
-          <w:color w:val="000000"/>
-          <w:sz w:val="19"/>
-          <w:szCs w:val="19"/>
-        </w:rPr>
-        <w:t>Automated scan scheduling via Bash and cron; built delta-scan logic to flag new CVEs and calculate remediation SLA deadlines (Critical=24hrs, High=7 days, Medium=30 days).</w:t>
+        <w:spacing w:before="13" w:after="45"/>
+      </w:pPr>
+      <w:r>
+        <w:rPr>
+          <w:rFonts w:ascii="Source Sans Pro" w:eastAsia="Source Sans Pro" w:hAnsi="Source Sans Pro" w:cs="Source Sans Pro"/>
+          <w:color w:val="000000"/>
+          <w:sz w:val="19"/>
+          <w:szCs w:val="19"/>
+        </w:rPr>
+        <w:t>Automated scan scheduling via Bash and cron; built delta-scan logic to flag CVEs and calculate remediation SLA deadlines (Critical=24hrs, High=7 days, Medium=30 days).</w:t>
       </w:r>
     </w:p>
     <w:p>
       <w:pPr>
         <w:pStyle w:val="ListParagraph"/>
-        <w:spacing w:before="14" w:after="14"/>
+        <w:spacing w:before="32" w:after="32"/>
         <w:ind w:left="450"/>
       </w:pPr>
     </w:p>
@@ -747,7 +747,7 @@
         <w:pBdr>
           <w:bottom w:val="single" w:sz="6" w:space="1" w:color="000000"/>
         </w:pBdr>
-        <w:spacing w:before="89" w:after="0"/>
+        <w:spacing w:before="172" w:after="0"/>
       </w:pPr>
       <w:r>
         <w:rPr>
@@ -763,7 +763,7 @@
     </w:p>
     <w:p>
       <w:pPr>
-        <w:spacing w:before="41" w:after="41"/>
+        <w:spacing w:before="62" w:after="62"/>
       </w:pPr>
       <w:r>
         <w:rPr>
@@ -785,7 +785,7 @@
     </w:p>
     <w:p>
       <w:pPr>
-        <w:spacing w:before="41" w:after="41"/>
+        <w:spacing w:before="62" w:after="62"/>
       </w:pPr>
       <w:r>
         <w:rPr>
@@ -807,7 +807,7 @@
     </w:p>
     <w:p>
       <w:pPr>
-        <w:spacing w:before="41" w:after="41"/>
+        <w:spacing w:before="62" w:after="62"/>
       </w:pPr>
       <w:r>
         <w:rPr>
@@ -829,7 +829,7 @@
     </w:p>
     <w:p>
       <w:pPr>
-        <w:spacing w:before="41" w:after="41"/>
+        <w:spacing w:before="62" w:after="62"/>
       </w:pPr>
       <w:r>
         <w:rPr>
@@ -851,7 +851,7 @@
     </w:p>
     <w:p>
       <w:pPr>
-        <w:spacing w:before="41" w:after="41"/>
+        <w:spacing w:before="62" w:after="62"/>
       </w:pPr>
       <w:r>
         <w:rPr>
@@ -868,7 +868,7 @@
           <w:sz w:val="19"/>
           <w:szCs w:val="19"/>
         </w:rPr>
-        <w:t>MITRE ATT&amp;CK, OWASP Top 10, Incident Response (PICERL), audit trail documentation, management, analysis, management</w:t>
+        <w:t>MITRE ATT&amp;CK, OWASP Top 10, Incident Response (PICERL), audit trail documentation, analysis, management, analysis</w:t>
       </w:r>
     </w:p>
     <w:p>
@@ -876,7 +876,7 @@
         <w:pBdr>
           <w:bottom w:val="single" w:sz="6" w:space="1" w:color="000000"/>
         </w:pBdr>
-        <w:spacing w:before="14" w:after="14"/>
+        <w:spacing w:before="32" w:after="32"/>
         <w:rPr>
           <w:rFonts w:ascii="Source Sans Pro" w:eastAsia="Source Sans Pro" w:hAnsi="Source Sans Pro" w:cs="Source Sans Pro"/>
           <w:b/>
@@ -892,7 +892,7 @@
         <w:pBdr>
           <w:bottom w:val="single" w:sz="6" w:space="1" w:color="000000"/>
         </w:pBdr>
-        <w:spacing w:before="89" w:after="0"/>
+        <w:spacing w:before="172" w:after="0"/>
       </w:pPr>
       <w:r>
         <w:rPr>
@@ -913,7 +913,7 @@
           <w:ilvl w:val="0"/>
           <w:numId w:val="2"/>
         </w:numPr>
-        <w:spacing w:before="13" w:after="27"/>
+        <w:spacing w:before="13" w:after="45"/>
       </w:pPr>
       <w:r>
         <w:rPr>
@@ -932,7 +932,7 @@
           <w:ilvl w:val="0"/>
           <w:numId w:val="2"/>
         </w:numPr>
-        <w:spacing w:before="13" w:after="27"/>
+        <w:spacing w:before="13" w:after="45"/>
       </w:pPr>
       <w:r>
         <w:rPr>

</xml_diff>